<commit_message>
The deck that builds itself, and the written answers as they go to the meeting
The deck is generated from scripts/deck/ rather than dragged into place slide by
slide, so it carries the brand tokens the letter and the portal already use and
can be rebuilt when a number moves. Its screenshots live beside it.

Python bytecode from that builder joins the ignore list.

Co-Authored-By: Claude Opus 5 (1M context) <noreply@anthropic.com>
</commit_message>
<xml_diff>
--- a/Deliverables/Answers.docx
+++ b/Deliverables/Answers.docx
@@ -109,7 +109,114 @@
           <w:szCs w:val="22"/>
           <w:lang w:val="pt-BR"/>
         </w:rPr>
-        <w:t xml:space="preserve"> happening?</w:t>
+        <w:t xml:space="preserve"> happening</w:t>
+      </w:r>
+      <w:r>
+        <w:rPr>
+          <w:rFonts w:ascii="Calibri Light" w:hAnsi="Calibri Light" w:cs="Calibri Light"/>
+          <w:b/>
+          <w:bCs/>
+          <w:sz w:val="22"/>
+          <w:szCs w:val="22"/>
+          <w:lang w:val="pt-BR"/>
+        </w:rPr>
+        <w:t xml:space="preserve"> </w:t>
+      </w:r>
+      <w:proofErr w:type="spellStart"/>
+      <w:r>
+        <w:rPr>
+          <w:rFonts w:ascii="Calibri Light" w:hAnsi="Calibri Light" w:cs="Calibri Light"/>
+          <w:b/>
+          <w:bCs/>
+          <w:sz w:val="22"/>
+          <w:szCs w:val="22"/>
+          <w:lang w:val="pt-BR"/>
+        </w:rPr>
+        <w:t>and</w:t>
+      </w:r>
+      <w:proofErr w:type="spellEnd"/>
+      <w:r>
+        <w:rPr>
+          <w:rFonts w:ascii="Calibri Light" w:hAnsi="Calibri Light" w:cs="Calibri Light"/>
+          <w:b/>
+          <w:bCs/>
+          <w:sz w:val="22"/>
+          <w:szCs w:val="22"/>
+          <w:lang w:val="pt-BR"/>
+        </w:rPr>
+        <w:t xml:space="preserve"> </w:t>
+      </w:r>
+      <w:proofErr w:type="spellStart"/>
+      <w:r>
+        <w:rPr>
+          <w:rFonts w:ascii="Calibri Light" w:hAnsi="Calibri Light" w:cs="Calibri Light"/>
+          <w:b/>
+          <w:bCs/>
+          <w:sz w:val="22"/>
+          <w:szCs w:val="22"/>
+          <w:lang w:val="pt-BR"/>
+        </w:rPr>
+        <w:t>why</w:t>
+      </w:r>
+      <w:proofErr w:type="spellEnd"/>
+      <w:r>
+        <w:rPr>
+          <w:rFonts w:ascii="Calibri Light" w:hAnsi="Calibri Light" w:cs="Calibri Light"/>
+          <w:b/>
+          <w:bCs/>
+          <w:sz w:val="22"/>
+          <w:szCs w:val="22"/>
+          <w:lang w:val="pt-BR"/>
+        </w:rPr>
+        <w:t xml:space="preserve"> are </w:t>
+      </w:r>
+      <w:proofErr w:type="spellStart"/>
+      <w:r>
+        <w:rPr>
+          <w:rFonts w:ascii="Calibri Light" w:hAnsi="Calibri Light" w:cs="Calibri Light"/>
+          <w:b/>
+          <w:bCs/>
+          <w:sz w:val="22"/>
+          <w:szCs w:val="22"/>
+          <w:lang w:val="pt-BR"/>
+        </w:rPr>
+        <w:t>we</w:t>
+      </w:r>
+      <w:proofErr w:type="spellEnd"/>
+      <w:r>
+        <w:rPr>
+          <w:rFonts w:ascii="Calibri Light" w:hAnsi="Calibri Light" w:cs="Calibri Light"/>
+          <w:b/>
+          <w:bCs/>
+          <w:sz w:val="22"/>
+          <w:szCs w:val="22"/>
+          <w:lang w:val="pt-BR"/>
+        </w:rPr>
+        <w:t xml:space="preserve"> </w:t>
+      </w:r>
+      <w:proofErr w:type="spellStart"/>
+      <w:r>
+        <w:rPr>
+          <w:rFonts w:ascii="Calibri Light" w:hAnsi="Calibri Light" w:cs="Calibri Light"/>
+          <w:b/>
+          <w:bCs/>
+          <w:sz w:val="22"/>
+          <w:szCs w:val="22"/>
+          <w:lang w:val="pt-BR"/>
+        </w:rPr>
+        <w:t>here</w:t>
+      </w:r>
+      <w:proofErr w:type="spellEnd"/>
+      <w:r>
+        <w:rPr>
+          <w:rFonts w:ascii="Calibri Light" w:hAnsi="Calibri Light" w:cs="Calibri Light"/>
+          <w:b/>
+          <w:bCs/>
+          <w:sz w:val="22"/>
+          <w:szCs w:val="22"/>
+          <w:lang w:val="pt-BR"/>
+        </w:rPr>
+        <w:t>?</w:t>
       </w:r>
     </w:p>
     <w:p>
@@ -147,16 +254,36 @@
           <w:szCs w:val="22"/>
           <w:lang w:val="pt-BR"/>
         </w:rPr>
-        <w:t xml:space="preserve">, e a primeira tentativa de resolver isso </w:t>
-      </w:r>
-      <w:r>
-        <w:rPr>
-          <w:rFonts w:ascii="Calibri Light" w:hAnsi="Calibri Light" w:cs="Calibri Light"/>
-          <w:sz w:val="22"/>
-          <w:szCs w:val="22"/>
-          <w:lang w:val="pt-BR"/>
-        </w:rPr>
-        <w:t>mostrou diversos erros de execução</w:t>
+        <w:t>. A</w:t>
+      </w:r>
+      <w:r>
+        <w:rPr>
+          <w:rFonts w:ascii="Calibri Light" w:hAnsi="Calibri Light" w:cs="Calibri Light"/>
+          <w:sz w:val="22"/>
+          <w:szCs w:val="22"/>
+          <w:lang w:val="pt-BR"/>
+        </w:rPr>
+        <w:t xml:space="preserve"> primeira tentativa de resolver isso </w:t>
+      </w:r>
+      <w:r>
+        <w:rPr>
+          <w:rFonts w:ascii="Calibri Light" w:hAnsi="Calibri Light" w:cs="Calibri Light"/>
+          <w:sz w:val="22"/>
+          <w:szCs w:val="22"/>
+          <w:lang w:val="pt-BR"/>
+        </w:rPr>
+        <w:t xml:space="preserve">mostrou diversos </w:t>
+      </w:r>
+      <w:r>
+        <w:rPr>
+          <w:rFonts w:ascii="Calibri Light" w:hAnsi="Calibri Light" w:cs="Calibri Light"/>
+          <w:b/>
+          <w:bCs/>
+          <w:sz w:val="22"/>
+          <w:szCs w:val="22"/>
+          <w:lang w:val="pt-BR"/>
+        </w:rPr>
+        <w:t>erros de execução</w:t>
       </w:r>
       <w:r>
         <w:rPr>
@@ -205,45 +332,25 @@
           <w:szCs w:val="22"/>
           <w:lang w:val="pt-BR"/>
         </w:rPr>
-        <w:t xml:space="preserve">Na análise, o resultado é o esperado. </w:t>
-      </w:r>
-      <w:r>
-        <w:rPr>
-          <w:rFonts w:ascii="Calibri Light" w:hAnsi="Calibri Light" w:cs="Calibri Light"/>
-          <w:sz w:val="22"/>
-          <w:szCs w:val="22"/>
-          <w:lang w:val="pt-BR"/>
-        </w:rPr>
-        <w:t>Por exemplo, a</w:t>
-      </w:r>
-      <w:r>
-        <w:rPr>
-          <w:rFonts w:ascii="Calibri Light" w:hAnsi="Calibri Light" w:cs="Calibri Light"/>
-          <w:sz w:val="22"/>
-          <w:szCs w:val="22"/>
-          <w:lang w:val="pt-BR"/>
-        </w:rPr>
-        <w:t xml:space="preserve"> carta de Albert começa "Prezado João". O retorno de 3,5% e o benchmark não existem em fonte alguma; os "17,4% dos fundos" são a média das rentabilidades desde 2021 lida como mês; HAPV3 aparece em queda quando o CSV mostra +76%. A macro contradiz o relatório recebido — </w:t>
-      </w:r>
-      <w:proofErr w:type="spellStart"/>
-      <w:r>
-        <w:rPr>
-          <w:rFonts w:ascii="Calibri Light" w:hAnsi="Calibri Light" w:cs="Calibri Light"/>
-          <w:sz w:val="22"/>
-          <w:szCs w:val="22"/>
-          <w:lang w:val="pt-BR"/>
-        </w:rPr>
-        <w:t>Fed</w:t>
-      </w:r>
-      <w:proofErr w:type="spellEnd"/>
-      <w:r>
-        <w:rPr>
-          <w:rFonts w:ascii="Calibri Light" w:hAnsi="Calibri Light" w:cs="Calibri Light"/>
-          <w:sz w:val="22"/>
-          <w:szCs w:val="22"/>
-          <w:lang w:val="pt-BR"/>
-        </w:rPr>
-        <w:t xml:space="preserve"> cortando, IPCA 4,0%, Selic 9%, câmbio 4,70, contra sem cortes, 6,1%, 15,50% e 6,20 — ou seja, o modelo escreveu de memória. O que importava ficou de fora: R$ 74,7 mil em caixa, dois fundos com 54% do investido, um CDB vencido oito meses antes. A recomendação, "continue diversificando", ignora o perfil e sai assinada por um assessor que não a leu.</w:t>
+        <w:t>À primeira vista a carta parece cumprir o pedido: tem saudação, análise, cenário e recomendação. Lida contra as fontes, quase nada se sustenta.</w:t>
+      </w:r>
+      <w:r>
+        <w:rPr>
+          <w:rFonts w:ascii="Calibri Light" w:hAnsi="Calibri Light" w:cs="Calibri Light"/>
+          <w:sz w:val="22"/>
+          <w:szCs w:val="22"/>
+          <w:lang w:val="pt-BR"/>
+        </w:rPr>
+        <w:t xml:space="preserve"> </w:t>
+      </w:r>
+      <w:r>
+        <w:rPr>
+          <w:rFonts w:ascii="Calibri Light" w:hAnsi="Calibri Light" w:cs="Calibri Light"/>
+          <w:sz w:val="22"/>
+          <w:szCs w:val="22"/>
+          <w:lang w:val="pt-BR"/>
+        </w:rPr>
+        <w:t>Começa pelo destinatário. A carta é de Albert, mas abre com "Prezado João". Os números da análise não vêm de lugar nenhum: o retorno de 3,5% e o benchmark não aparecem em fonte alguma. Os "17,4% dos fundos" são a média das rentabilidades acumuladas desde 2021, lida como se fosse o resultado do mês. HAPV3 aparece em queda, quando o CSV mostra alta de 76%.</w:t>
       </w:r>
     </w:p>
     <w:p>
@@ -263,7 +370,36 @@
           <w:szCs w:val="22"/>
           <w:lang w:val="pt-BR"/>
         </w:rPr>
-        <w:t>Na forma, são 477 palavras em oito parágrafos sem título, data, mês de referência, tabela, gráfico, fontes ou aviso regulatório; os números estão enterrados em frases de quarenta palavras, e a segunda página fica quase vazia.</w:t>
+        <w:t xml:space="preserve">O cenário macro é o erro mais grave, porque contradiz o relatório que a carta recebeu como insumo. A carta fala em </w:t>
+      </w:r>
+      <w:proofErr w:type="spellStart"/>
+      <w:r>
+        <w:rPr>
+          <w:rFonts w:ascii="Calibri Light" w:hAnsi="Calibri Light" w:cs="Calibri Light"/>
+          <w:sz w:val="22"/>
+          <w:szCs w:val="22"/>
+          <w:lang w:val="pt-BR"/>
+        </w:rPr>
+        <w:t>Fed</w:t>
+      </w:r>
+      <w:proofErr w:type="spellEnd"/>
+      <w:r>
+        <w:rPr>
+          <w:rFonts w:ascii="Calibri Light" w:hAnsi="Calibri Light" w:cs="Calibri Light"/>
+          <w:sz w:val="22"/>
+          <w:szCs w:val="22"/>
+          <w:lang w:val="pt-BR"/>
+        </w:rPr>
+        <w:t xml:space="preserve"> cortando juros, IPCA de 4,0%, Selic de 9% e câmbio a 4,70. O relatório diz o oposto: sem cortes, IPCA de 6,1%, Selic de 15,50% e câmbio a 6,20. O modelo não leu o relatório</w:t>
+      </w:r>
+      <w:r>
+        <w:rPr>
+          <w:rFonts w:ascii="Calibri Light" w:hAnsi="Calibri Light" w:cs="Calibri Light"/>
+          <w:sz w:val="22"/>
+          <w:szCs w:val="22"/>
+          <w:lang w:val="pt-BR"/>
+        </w:rPr>
+        <w:t>.</w:t>
       </w:r>
     </w:p>
     <w:p>
@@ -283,7 +419,25 @@
           <w:szCs w:val="22"/>
           <w:lang w:val="pt-BR"/>
         </w:rPr>
-        <w:t>A causa é uma só: o modelo foi posto como calculadora, analista, compliance e redator ao mesmo tempo, sem que nenhum papel pudesse ser conferido.</w:t>
+        <w:t xml:space="preserve">Faltam também </w:t>
+      </w:r>
+      <w:r>
+        <w:rPr>
+          <w:rFonts w:ascii="Calibri Light" w:hAnsi="Calibri Light" w:cs="Calibri Light"/>
+          <w:sz w:val="22"/>
+          <w:szCs w:val="22"/>
+          <w:lang w:val="pt-BR"/>
+        </w:rPr>
+        <w:t>aquilo que um</w:t>
+      </w:r>
+      <w:r>
+        <w:rPr>
+          <w:rFonts w:ascii="Calibri Light" w:hAnsi="Calibri Light" w:cs="Calibri Light"/>
+          <w:sz w:val="22"/>
+          <w:szCs w:val="22"/>
+          <w:lang w:val="pt-BR"/>
+        </w:rPr>
+        <w:t xml:space="preserve"> assessor veria de imediato: R$ 74,7 mil parados em caixa, dois fundos que concentram 54% do investido e um CDB vencido oito meses antes. E a recomendação, "continue diversificando", serve para qualquer cliente. Ignora o perfil e sai assinada por um assessor que não a leu.</w:t>
       </w:r>
     </w:p>
     <w:p>
@@ -367,7 +521,487 @@
           <w:szCs w:val="22"/>
           <w:lang w:val="pt-BR"/>
         </w:rPr>
-        <w:t>recommend?</w:t>
+        <w:t>recommend</w:t>
+      </w:r>
+      <w:proofErr w:type="spellEnd"/>
+      <w:r>
+        <w:rPr>
+          <w:rFonts w:ascii="Calibri Light" w:hAnsi="Calibri Light" w:cs="Calibri Light"/>
+          <w:b/>
+          <w:bCs/>
+          <w:sz w:val="22"/>
+          <w:szCs w:val="22"/>
+          <w:lang w:val="pt-BR"/>
+        </w:rPr>
+        <w:t>?</w:t>
+      </w:r>
+    </w:p>
+    <w:p>
+      <w:pPr>
+        <w:jc w:val="both"/>
+        <w:rPr>
+          <w:rFonts w:ascii="Calibri Light" w:hAnsi="Calibri Light" w:cs="Calibri Light"/>
+          <w:b/>
+          <w:bCs/>
+          <w:sz w:val="22"/>
+          <w:szCs w:val="22"/>
+          <w:lang w:val="pt-BR"/>
+        </w:rPr>
+      </w:pPr>
+      <w:r>
+        <w:rPr>
+          <w:rFonts w:ascii="Calibri Light" w:hAnsi="Calibri Light" w:cs="Calibri Light"/>
+          <w:sz w:val="22"/>
+          <w:szCs w:val="22"/>
+          <w:lang w:val="pt-BR"/>
+        </w:rPr>
+        <w:t xml:space="preserve">Recomendamos a construção de um novo </w:t>
+      </w:r>
+      <w:r>
+        <w:rPr>
+          <w:rFonts w:ascii="Calibri Light" w:hAnsi="Calibri Light" w:cs="Calibri Light"/>
+          <w:sz w:val="22"/>
+          <w:szCs w:val="22"/>
+          <w:lang w:val="pt-BR"/>
+        </w:rPr>
+        <w:t>produto</w:t>
+      </w:r>
+      <w:r>
+        <w:rPr>
+          <w:rFonts w:ascii="Calibri Light" w:hAnsi="Calibri Light" w:cs="Calibri Light"/>
+          <w:sz w:val="22"/>
+          <w:szCs w:val="22"/>
+          <w:lang w:val="pt-BR"/>
+        </w:rPr>
+        <w:t>, que</w:t>
+      </w:r>
+      <w:r>
+        <w:rPr>
+          <w:rFonts w:ascii="Calibri Light" w:hAnsi="Calibri Light" w:cs="Calibri Light"/>
+          <w:sz w:val="22"/>
+          <w:szCs w:val="22"/>
+          <w:lang w:val="pt-BR"/>
+        </w:rPr>
+        <w:t xml:space="preserve"> se formou de duas pontas que se encontraram no meio.</w:t>
+      </w:r>
+    </w:p>
+    <w:p>
+      <w:pPr>
+        <w:jc w:val="both"/>
+        <w:rPr>
+          <w:rFonts w:ascii="Calibri Light" w:hAnsi="Calibri Light" w:cs="Calibri Light"/>
+          <w:sz w:val="22"/>
+          <w:szCs w:val="22"/>
+          <w:lang w:val="pt-BR"/>
+        </w:rPr>
+      </w:pPr>
+      <w:r>
+        <w:rPr>
+          <w:rFonts w:ascii="Calibri Light" w:hAnsi="Calibri Light" w:cs="Calibri Light"/>
+          <w:sz w:val="22"/>
+          <w:szCs w:val="22"/>
+          <w:lang w:val="pt-BR"/>
+        </w:rPr>
+        <w:t>Top-</w:t>
+      </w:r>
+      <w:proofErr w:type="spellStart"/>
+      <w:r>
+        <w:rPr>
+          <w:rFonts w:ascii="Calibri Light" w:hAnsi="Calibri Light" w:cs="Calibri Light"/>
+          <w:sz w:val="22"/>
+          <w:szCs w:val="22"/>
+          <w:lang w:val="pt-BR"/>
+        </w:rPr>
+        <w:t>down</w:t>
+      </w:r>
+      <w:proofErr w:type="spellEnd"/>
+      <w:r>
+        <w:rPr>
+          <w:rFonts w:ascii="Calibri Light" w:hAnsi="Calibri Light" w:cs="Calibri Light"/>
+          <w:sz w:val="22"/>
+          <w:szCs w:val="22"/>
+          <w:lang w:val="pt-BR"/>
+        </w:rPr>
+        <w:t xml:space="preserve">, a </w:t>
+      </w:r>
+      <w:r>
+        <w:rPr>
+          <w:rFonts w:ascii="Calibri Light" w:hAnsi="Calibri Light" w:cs="Calibri Light"/>
+          <w:b/>
+          <w:bCs/>
+          <w:sz w:val="22"/>
+          <w:szCs w:val="22"/>
+          <w:lang w:val="pt-BR"/>
+        </w:rPr>
+        <w:t>carta</w:t>
+      </w:r>
+      <w:r>
+        <w:rPr>
+          <w:rFonts w:ascii="Calibri Light" w:hAnsi="Calibri Light" w:cs="Calibri Light"/>
+          <w:sz w:val="22"/>
+          <w:szCs w:val="22"/>
+          <w:lang w:val="pt-BR"/>
+        </w:rPr>
+        <w:t>. Inspirado nas melhores cartas de gestores de fundos que conheço, o entregável estava claro desde o primeiro dia: um documento que o cliente lê inteiro e do qual sai sabendo por que sua carteira rendeu o que rendeu e o que fazer a respeito. A pergunta nunca foi como escrever uma carta dessas — foi como escrever trezentas por mês, uma por cliente, sem que nenhuma delas fique genérica.</w:t>
+      </w:r>
+      <w:r>
+        <w:rPr>
+          <w:rFonts w:ascii="Calibri Light" w:hAnsi="Calibri Light" w:cs="Calibri Light"/>
+          <w:sz w:val="22"/>
+          <w:szCs w:val="22"/>
+          <w:lang w:val="pt-BR"/>
+        </w:rPr>
+        <w:t xml:space="preserve"> Branding</w:t>
+      </w:r>
+    </w:p>
+    <w:p>
+      <w:pPr>
+        <w:jc w:val="both"/>
+        <w:rPr>
+          <w:rFonts w:ascii="Calibri Light" w:hAnsi="Calibri Light" w:cs="Calibri Light"/>
+          <w:sz w:val="22"/>
+          <w:szCs w:val="22"/>
+          <w:lang w:val="pt-BR"/>
+        </w:rPr>
+      </w:pPr>
+      <w:proofErr w:type="spellStart"/>
+      <w:r>
+        <w:rPr>
+          <w:rFonts w:ascii="Calibri Light" w:hAnsi="Calibri Light" w:cs="Calibri Light"/>
+          <w:sz w:val="22"/>
+          <w:szCs w:val="22"/>
+          <w:lang w:val="pt-BR"/>
+        </w:rPr>
+        <w:t>Bottom-up</w:t>
+      </w:r>
+      <w:proofErr w:type="spellEnd"/>
+      <w:r>
+        <w:rPr>
+          <w:rFonts w:ascii="Calibri Light" w:hAnsi="Calibri Light" w:cs="Calibri Light"/>
+          <w:sz w:val="22"/>
+          <w:szCs w:val="22"/>
+          <w:lang w:val="pt-BR"/>
+        </w:rPr>
+        <w:t xml:space="preserve">, os </w:t>
+      </w:r>
+      <w:r>
+        <w:rPr>
+          <w:rFonts w:ascii="Calibri Light" w:hAnsi="Calibri Light" w:cs="Calibri Light"/>
+          <w:b/>
+          <w:bCs/>
+          <w:sz w:val="22"/>
+          <w:szCs w:val="22"/>
+          <w:lang w:val="pt-BR"/>
+        </w:rPr>
+        <w:t>dados</w:t>
+      </w:r>
+      <w:r>
+        <w:rPr>
+          <w:rFonts w:ascii="Calibri Light" w:hAnsi="Calibri Light" w:cs="Calibri Light"/>
+          <w:sz w:val="22"/>
+          <w:szCs w:val="22"/>
+          <w:lang w:val="pt-BR"/>
+        </w:rPr>
+        <w:t xml:space="preserve">. Para essa carta existir, três camadas precisam existir antes dela. Primeiro, um lugar confiável onde preços, posições e políticas ficam guardados — o D1 e o R2 da </w:t>
+      </w:r>
+      <w:proofErr w:type="spellStart"/>
+      <w:r>
+        <w:rPr>
+          <w:rFonts w:ascii="Calibri Light" w:hAnsi="Calibri Light" w:cs="Calibri Light"/>
+          <w:sz w:val="22"/>
+          <w:szCs w:val="22"/>
+          <w:lang w:val="pt-BR"/>
+        </w:rPr>
+        <w:t>Cloudflare</w:t>
+      </w:r>
+      <w:proofErr w:type="spellEnd"/>
+      <w:r>
+        <w:rPr>
+          <w:rFonts w:ascii="Calibri Light" w:hAnsi="Calibri Light" w:cs="Calibri Light"/>
+          <w:sz w:val="22"/>
+          <w:szCs w:val="22"/>
+          <w:lang w:val="pt-BR"/>
+        </w:rPr>
+        <w:t xml:space="preserve"> bastaram para esta primeira etapa. </w:t>
+      </w:r>
+      <w:proofErr w:type="gramStart"/>
+      <w:r>
+        <w:rPr>
+          <w:rFonts w:ascii="Calibri Light" w:hAnsi="Calibri Light" w:cs="Calibri Light"/>
+          <w:sz w:val="22"/>
+          <w:szCs w:val="22"/>
+          <w:lang w:val="pt-BR"/>
+        </w:rPr>
+        <w:t>Segundo, o</w:t>
+      </w:r>
+      <w:proofErr w:type="gramEnd"/>
+      <w:r>
+        <w:rPr>
+          <w:rFonts w:ascii="Calibri Light" w:hAnsi="Calibri Light" w:cs="Calibri Light"/>
+          <w:sz w:val="22"/>
+          <w:szCs w:val="22"/>
+          <w:lang w:val="pt-BR"/>
+        </w:rPr>
+        <w:t xml:space="preserve"> cálculo em cima deles: rentabilidade, atribuição, volatilidade e o impacto dos movimentos do mês nesta carteira, não no mercado em geral. Terceiro, a tradução do resultado em texto, gráfico e tabela.</w:t>
+      </w:r>
+    </w:p>
+    <w:p>
+      <w:pPr>
+        <w:jc w:val="both"/>
+        <w:rPr>
+          <w:rFonts w:ascii="Calibri Light" w:hAnsi="Calibri Light" w:cs="Calibri Light"/>
+          <w:sz w:val="22"/>
+          <w:szCs w:val="22"/>
+          <w:lang w:val="pt-BR"/>
+        </w:rPr>
+      </w:pPr>
+      <w:r>
+        <w:rPr>
+          <w:rFonts w:ascii="Calibri Light" w:hAnsi="Calibri Light" w:cs="Calibri Light"/>
+          <w:sz w:val="22"/>
+          <w:szCs w:val="22"/>
+          <w:lang w:val="pt-BR"/>
+        </w:rPr>
+        <w:t>O que foi construído é o encontro dos dois: um portal onde o assessor vê o que aconteceu no dia e, com um botão, produz a carta do mês de um cliente — ou do seu book inteiro.</w:t>
+      </w:r>
+      <w:r>
+        <w:rPr>
+          <w:rFonts w:ascii="Calibri Light" w:hAnsi="Calibri Light" w:cs="Calibri Light"/>
+          <w:sz w:val="22"/>
+          <w:szCs w:val="22"/>
+          <w:lang w:val="pt-BR"/>
+        </w:rPr>
+        <w:t xml:space="preserve"> </w:t>
+      </w:r>
+      <w:proofErr w:type="spellStart"/>
+      <w:r>
+        <w:rPr>
+          <w:rFonts w:ascii="Calibri Light" w:hAnsi="Calibri Light" w:cs="Calibri Light"/>
+          <w:sz w:val="22"/>
+          <w:szCs w:val="22"/>
+          <w:lang w:val="pt-BR"/>
+        </w:rPr>
+        <w:t>Cloudflare</w:t>
+      </w:r>
+      <w:proofErr w:type="spellEnd"/>
+      <w:r>
+        <w:rPr>
+          <w:rFonts w:ascii="Calibri Light" w:hAnsi="Calibri Light" w:cs="Calibri Light"/>
+          <w:sz w:val="22"/>
+          <w:szCs w:val="22"/>
+          <w:lang w:val="pt-BR"/>
+        </w:rPr>
+        <w:t xml:space="preserve"> é onde tudo roda e fica guardado: o </w:t>
+      </w:r>
+      <w:proofErr w:type="spellStart"/>
+      <w:r>
+        <w:rPr>
+          <w:rFonts w:ascii="Calibri Light" w:hAnsi="Calibri Light" w:cs="Calibri Light"/>
+          <w:sz w:val="22"/>
+          <w:szCs w:val="22"/>
+          <w:lang w:val="pt-BR"/>
+        </w:rPr>
+        <w:t>Worker</w:t>
+      </w:r>
+      <w:proofErr w:type="spellEnd"/>
+      <w:r>
+        <w:rPr>
+          <w:rFonts w:ascii="Calibri Light" w:hAnsi="Calibri Light" w:cs="Calibri Light"/>
+          <w:sz w:val="22"/>
+          <w:szCs w:val="22"/>
+          <w:lang w:val="pt-BR"/>
+        </w:rPr>
+        <w:t xml:space="preserve"> serve os portais e a API, os Workflows executam os trabalhos longos (os três agentes do dia, a carta mensal, </w:t>
+      </w:r>
+      <w:r>
+        <w:rPr>
+          <w:rFonts w:ascii="Calibri Light" w:hAnsi="Calibri Light" w:cs="Calibri Light"/>
+          <w:sz w:val="22"/>
+          <w:szCs w:val="22"/>
+          <w:lang w:val="pt-BR"/>
+        </w:rPr>
+        <w:lastRenderedPageBreak/>
+        <w:t xml:space="preserve">o lote), o </w:t>
+      </w:r>
+      <w:proofErr w:type="spellStart"/>
+      <w:r>
+        <w:rPr>
+          <w:rFonts w:ascii="Calibri Light" w:hAnsi="Calibri Light" w:cs="Calibri Light"/>
+          <w:sz w:val="22"/>
+          <w:szCs w:val="22"/>
+          <w:lang w:val="pt-BR"/>
+        </w:rPr>
+        <w:t>cron</w:t>
+      </w:r>
+      <w:proofErr w:type="spellEnd"/>
+      <w:r>
+        <w:rPr>
+          <w:rFonts w:ascii="Calibri Light" w:hAnsi="Calibri Light" w:cs="Calibri Light"/>
+          <w:sz w:val="22"/>
+          <w:szCs w:val="22"/>
+          <w:lang w:val="pt-BR"/>
+        </w:rPr>
+        <w:t xml:space="preserve"> os dispara às 07:00, o D1 guarda o registro (clientes, política, aprovações), o R2 os arquivos (</w:t>
+      </w:r>
+      <w:proofErr w:type="spellStart"/>
+      <w:r>
+        <w:rPr>
+          <w:rFonts w:ascii="Calibri Light" w:hAnsi="Calibri Light" w:cs="Calibri Light"/>
+          <w:sz w:val="22"/>
+          <w:szCs w:val="22"/>
+          <w:lang w:val="pt-BR"/>
+        </w:rPr>
+        <w:t>PDFs</w:t>
+      </w:r>
+      <w:proofErr w:type="spellEnd"/>
+      <w:r>
+        <w:rPr>
+          <w:rFonts w:ascii="Calibri Light" w:hAnsi="Calibri Light" w:cs="Calibri Light"/>
+          <w:sz w:val="22"/>
+          <w:szCs w:val="22"/>
+          <w:lang w:val="pt-BR"/>
+        </w:rPr>
+        <w:t>, séries de preços, políticas assinadas) e o KV o cache dos provedores.</w:t>
+      </w:r>
+      <w:r>
+        <w:rPr>
+          <w:rFonts w:ascii="Calibri Light" w:hAnsi="Calibri Light" w:cs="Calibri Light"/>
+          <w:sz w:val="22"/>
+          <w:szCs w:val="22"/>
+          <w:lang w:val="pt-BR"/>
+        </w:rPr>
+        <w:t xml:space="preserve"> Todos os dados são buscados em </w:t>
+      </w:r>
+      <w:r>
+        <w:rPr>
+          <w:rFonts w:ascii="Calibri Light" w:hAnsi="Calibri Light" w:cs="Calibri Light"/>
+          <w:b/>
+          <w:bCs/>
+          <w:sz w:val="22"/>
+          <w:szCs w:val="22"/>
+          <w:lang w:val="pt-BR"/>
+        </w:rPr>
+        <w:t>fontes</w:t>
+      </w:r>
+      <w:r>
+        <w:rPr>
+          <w:rFonts w:ascii="Calibri Light" w:hAnsi="Calibri Light" w:cs="Calibri Light"/>
+          <w:sz w:val="22"/>
+          <w:szCs w:val="22"/>
+          <w:lang w:val="pt-BR"/>
+        </w:rPr>
+        <w:t xml:space="preserve"> </w:t>
+      </w:r>
+      <w:r>
+        <w:rPr>
+          <w:rFonts w:ascii="Calibri Light" w:hAnsi="Calibri Light" w:cs="Calibri Light"/>
+          <w:b/>
+          <w:bCs/>
+          <w:sz w:val="22"/>
+          <w:szCs w:val="22"/>
+          <w:lang w:val="pt-BR"/>
+        </w:rPr>
+        <w:t>abertas</w:t>
+      </w:r>
+      <w:r>
+        <w:rPr>
+          <w:rFonts w:ascii="Calibri Light" w:hAnsi="Calibri Light" w:cs="Calibri Light"/>
+          <w:sz w:val="22"/>
+          <w:szCs w:val="22"/>
+          <w:lang w:val="pt-BR"/>
+        </w:rPr>
+        <w:t xml:space="preserve">, </w:t>
+      </w:r>
+      <w:r>
+        <w:rPr>
+          <w:rFonts w:ascii="Calibri Light" w:hAnsi="Calibri Light" w:cs="Calibri Light"/>
+          <w:b/>
+          <w:bCs/>
+          <w:sz w:val="22"/>
+          <w:szCs w:val="22"/>
+          <w:lang w:val="pt-BR"/>
+        </w:rPr>
+        <w:t xml:space="preserve">sobretudo os relatórios </w:t>
+      </w:r>
+      <w:r>
+        <w:rPr>
+          <w:rFonts w:ascii="Calibri Light" w:hAnsi="Calibri Light" w:cs="Calibri Light"/>
+          <w:b/>
+          <w:bCs/>
+          <w:sz w:val="22"/>
+          <w:szCs w:val="22"/>
+          <w:lang w:val="pt-BR"/>
+        </w:rPr>
+        <w:t xml:space="preserve">mensais </w:t>
+      </w:r>
+      <w:r>
+        <w:rPr>
+          <w:rFonts w:ascii="Calibri Light" w:hAnsi="Calibri Light" w:cs="Calibri Light"/>
+          <w:sz w:val="22"/>
+          <w:szCs w:val="22"/>
+          <w:lang w:val="pt-BR"/>
+        </w:rPr>
+        <w:t>da própria XP.</w:t>
+      </w:r>
+    </w:p>
+    <w:p>
+      <w:pPr>
+        <w:jc w:val="both"/>
+        <w:rPr>
+          <w:rFonts w:ascii="Calibri Light" w:hAnsi="Calibri Light" w:cs="Calibri Light"/>
+          <w:sz w:val="22"/>
+          <w:szCs w:val="22"/>
+          <w:lang w:val="pt-BR"/>
+        </w:rPr>
+      </w:pPr>
+    </w:p>
+    <w:p>
+      <w:pPr>
+        <w:jc w:val="both"/>
+        <w:rPr>
+          <w:rFonts w:ascii="Calibri Light" w:hAnsi="Calibri Light" w:cs="Calibri Light"/>
+          <w:b/>
+          <w:bCs/>
+          <w:sz w:val="22"/>
+          <w:szCs w:val="22"/>
+          <w:lang w:val="pt-BR"/>
+        </w:rPr>
+      </w:pPr>
+      <w:proofErr w:type="spellStart"/>
+      <w:r>
+        <w:rPr>
+          <w:rFonts w:ascii="Calibri Light" w:hAnsi="Calibri Light" w:cs="Calibri Light"/>
+          <w:b/>
+          <w:bCs/>
+          <w:sz w:val="22"/>
+          <w:szCs w:val="22"/>
+          <w:lang w:val="pt-BR"/>
+        </w:rPr>
+        <w:t>How</w:t>
+      </w:r>
+      <w:proofErr w:type="spellEnd"/>
+      <w:r>
+        <w:rPr>
+          <w:rFonts w:ascii="Calibri Light" w:hAnsi="Calibri Light" w:cs="Calibri Light"/>
+          <w:b/>
+          <w:bCs/>
+          <w:sz w:val="22"/>
+          <w:szCs w:val="22"/>
+          <w:lang w:val="pt-BR"/>
+        </w:rPr>
+        <w:t xml:space="preserve"> it </w:t>
+      </w:r>
+      <w:proofErr w:type="spellStart"/>
+      <w:r>
+        <w:rPr>
+          <w:rFonts w:ascii="Calibri Light" w:hAnsi="Calibri Light" w:cs="Calibri Light"/>
+          <w:b/>
+          <w:bCs/>
+          <w:sz w:val="22"/>
+          <w:szCs w:val="22"/>
+          <w:lang w:val="pt-BR"/>
+        </w:rPr>
+        <w:t>works</w:t>
       </w:r>
       <w:proofErr w:type="spellEnd"/>
     </w:p>
@@ -376,8 +1010,6 @@
         <w:jc w:val="both"/>
         <w:rPr>
           <w:rFonts w:ascii="Calibri Light" w:hAnsi="Calibri Light" w:cs="Calibri Light"/>
-          <w:b/>
-          <w:bCs/>
           <w:sz w:val="22"/>
           <w:szCs w:val="22"/>
           <w:lang w:val="pt-BR"/>
@@ -390,34 +1022,27 @@
           <w:szCs w:val="22"/>
           <w:lang w:val="pt-BR"/>
         </w:rPr>
-        <w:t xml:space="preserve">Recomendamos a construção de um novo </w:t>
-      </w:r>
-      <w:r>
-        <w:rPr>
-          <w:rFonts w:ascii="Calibri Light" w:hAnsi="Calibri Light" w:cs="Calibri Light"/>
-          <w:sz w:val="22"/>
-          <w:szCs w:val="22"/>
-          <w:lang w:val="pt-BR"/>
-        </w:rPr>
-        <w:t>produto</w:t>
-      </w:r>
-      <w:r>
-        <w:rPr>
-          <w:rFonts w:ascii="Calibri Light" w:hAnsi="Calibri Light" w:cs="Calibri Light"/>
-          <w:sz w:val="22"/>
-          <w:szCs w:val="22"/>
-          <w:lang w:val="pt-BR"/>
-        </w:rPr>
-        <w:t>, que</w:t>
-      </w:r>
-      <w:r>
-        <w:rPr>
-          <w:rFonts w:ascii="Calibri Light" w:hAnsi="Calibri Light" w:cs="Calibri Light"/>
-          <w:sz w:val="22"/>
-          <w:szCs w:val="22"/>
-          <w:lang w:val="pt-BR"/>
-        </w:rPr>
-        <w:t xml:space="preserve"> se formou de duas pontas que se encontraram no meio.</w:t>
+        <w:t xml:space="preserve">Foram construídos quatro agentes. Três montam o panorama do dia e rodam sozinhos na nuvem, todo dia às sete da manhã — e de novo sempre que o assessor solicitar. O </w:t>
+      </w:r>
+      <w:proofErr w:type="gramStart"/>
+      <w:r>
+        <w:rPr>
+          <w:rFonts w:ascii="Calibri Light" w:hAnsi="Calibri Light" w:cs="Calibri Light"/>
+          <w:sz w:val="22"/>
+          <w:szCs w:val="22"/>
+          <w:lang w:val="pt-BR"/>
+        </w:rPr>
+        <w:t>primeiro busca</w:t>
+      </w:r>
+      <w:proofErr w:type="gramEnd"/>
+      <w:r>
+        <w:rPr>
+          <w:rFonts w:ascii="Calibri Light" w:hAnsi="Calibri Light" w:cs="Calibri Light"/>
+          <w:sz w:val="22"/>
+          <w:szCs w:val="22"/>
+          <w:lang w:val="pt-BR"/>
+        </w:rPr>
+        <w:t xml:space="preserve"> cotações, séries diárias, sinais técnicos e as manchetes das últimas 48 horas, e anota a fonte de cada número que traz. O segundo faz inferência: lê o que o primeiro reuniu junto da exposição de cada cliente por classe de ativo e decide o que, de tudo aquilo, importa para estas carteiras hoje; é ele que escreve o resumo do dia. O terceiro aciona gatilhos e compara cada indicador com os limiares configurados de cada carteira com a política que a governa, e diz quando uma ação é devida. Finalmente, o quarto consolida a carta mensal, comandado pelo assessor a partir da página do cliente, e trabalha em quatro etapas: reúne os dados do mês, calcula rentabilidade, atribuição e propostas, escreve a carta e a diagrama em PDF e e-mail e atualiza portal — e é esse mesmo agente que percorre o book inteiro quando o assessor pede todas as cartas de uma vez.</w:t>
       </w:r>
     </w:p>
     <w:p>
@@ -437,7 +1062,7 @@
           <w:szCs w:val="22"/>
           <w:lang w:val="pt-BR"/>
         </w:rPr>
-        <w:t>Top-</w:t>
+        <w:t xml:space="preserve">A base da construção foi em Claude </w:t>
       </w:r>
       <w:proofErr w:type="spellStart"/>
       <w:r>
@@ -447,7 +1072,7 @@
           <w:szCs w:val="22"/>
           <w:lang w:val="pt-BR"/>
         </w:rPr>
-        <w:t>down</w:t>
+        <w:t>Code</w:t>
       </w:r>
       <w:proofErr w:type="spellEnd"/>
       <w:r>
@@ -457,39 +1082,8 @@
           <w:szCs w:val="22"/>
           <w:lang w:val="pt-BR"/>
         </w:rPr>
-        <w:t xml:space="preserve">, a </w:t>
-      </w:r>
-      <w:r>
-        <w:rPr>
-          <w:rFonts w:ascii="Calibri Light" w:hAnsi="Calibri Light" w:cs="Calibri Light"/>
-          <w:b/>
-          <w:bCs/>
-          <w:sz w:val="22"/>
-          <w:szCs w:val="22"/>
-          <w:lang w:val="pt-BR"/>
-        </w:rPr>
-        <w:t>carta</w:t>
-      </w:r>
-      <w:r>
-        <w:rPr>
-          <w:rFonts w:ascii="Calibri Light" w:hAnsi="Calibri Light" w:cs="Calibri Light"/>
-          <w:sz w:val="22"/>
-          <w:szCs w:val="22"/>
-          <w:lang w:val="pt-BR"/>
-        </w:rPr>
-        <w:t>. Inspirado nas melhores cartas de gestores de fundos que conheço, o entregável estava claro desde o primeiro dia: um documento que o cliente lê inteiro e do qual sai sabendo por que sua carteira rendeu o que rendeu e o que fazer a respeito. A pergunta nunca foi como escrever uma carta dessas — foi como escrever trezentas por mês, uma por cliente, sem que nenhuma delas fique genérica.</w:t>
-      </w:r>
-    </w:p>
-    <w:p>
-      <w:pPr>
-        <w:jc w:val="both"/>
-        <w:rPr>
-          <w:rFonts w:ascii="Calibri Light" w:hAnsi="Calibri Light" w:cs="Calibri Light"/>
-          <w:sz w:val="22"/>
-          <w:szCs w:val="22"/>
-          <w:lang w:val="pt-BR"/>
-        </w:rPr>
-      </w:pPr>
+        <w:t xml:space="preserve">, usando API da </w:t>
+      </w:r>
       <w:proofErr w:type="spellStart"/>
       <w:r>
         <w:rPr>
@@ -498,7 +1092,7 @@
           <w:szCs w:val="22"/>
           <w:lang w:val="pt-BR"/>
         </w:rPr>
-        <w:t>Bottom-up</w:t>
+        <w:t>Anthropic</w:t>
       </w:r>
       <w:proofErr w:type="spellEnd"/>
       <w:r>
@@ -508,27 +1102,7 @@
           <w:szCs w:val="22"/>
           <w:lang w:val="pt-BR"/>
         </w:rPr>
-        <w:t xml:space="preserve">, os </w:t>
-      </w:r>
-      <w:r>
-        <w:rPr>
-          <w:rFonts w:ascii="Calibri Light" w:hAnsi="Calibri Light" w:cs="Calibri Light"/>
-          <w:b/>
-          <w:bCs/>
-          <w:sz w:val="22"/>
-          <w:szCs w:val="22"/>
-          <w:lang w:val="pt-BR"/>
-        </w:rPr>
-        <w:t>dados</w:t>
-      </w:r>
-      <w:r>
-        <w:rPr>
-          <w:rFonts w:ascii="Calibri Light" w:hAnsi="Calibri Light" w:cs="Calibri Light"/>
-          <w:sz w:val="22"/>
-          <w:szCs w:val="22"/>
-          <w:lang w:val="pt-BR"/>
-        </w:rPr>
-        <w:t xml:space="preserve">. Para essa carta existir, três camadas precisam existir antes dela. Primeiro, um lugar confiável onde preços, posições e políticas ficam guardados — o D1 e o R2 da </w:t>
+        <w:t xml:space="preserve">. Escreve e classifica: a carta, a leitura do dia e o assunto de cada manchete. Recebe os números já calculados; se devolver um que não estava nos fatos, a carta é recusada. Sem chave, um redator determinístico faz o mesmo em português. Cada etapa é um bloco que chama o </w:t>
       </w:r>
       <w:proofErr w:type="spellStart"/>
       <w:r>
@@ -538,7 +1112,7 @@
           <w:szCs w:val="22"/>
           <w:lang w:val="pt-BR"/>
         </w:rPr>
-        <w:t>Cloudflare</w:t>
+        <w:t>Worker</w:t>
       </w:r>
       <w:proofErr w:type="spellEnd"/>
       <w:r>
@@ -548,66 +1122,7 @@
           <w:szCs w:val="22"/>
           <w:lang w:val="pt-BR"/>
         </w:rPr>
-        <w:t xml:space="preserve"> bastaram para esta primeira etapa. </w:t>
-      </w:r>
-      <w:proofErr w:type="gramStart"/>
-      <w:r>
-        <w:rPr>
-          <w:rFonts w:ascii="Calibri Light" w:hAnsi="Calibri Light" w:cs="Calibri Light"/>
-          <w:sz w:val="22"/>
-          <w:szCs w:val="22"/>
-          <w:lang w:val="pt-BR"/>
-        </w:rPr>
-        <w:t>Segundo, o</w:t>
-      </w:r>
-      <w:proofErr w:type="gramEnd"/>
-      <w:r>
-        <w:rPr>
-          <w:rFonts w:ascii="Calibri Light" w:hAnsi="Calibri Light" w:cs="Calibri Light"/>
-          <w:sz w:val="22"/>
-          <w:szCs w:val="22"/>
-          <w:lang w:val="pt-BR"/>
-        </w:rPr>
-        <w:t xml:space="preserve"> cálculo em cima deles: rentabilidade, atribuição, volatilidade e o impacto dos </w:t>
-      </w:r>
-      <w:r>
-        <w:rPr>
-          <w:rFonts w:ascii="Calibri Light" w:hAnsi="Calibri Light" w:cs="Calibri Light"/>
-          <w:sz w:val="22"/>
-          <w:szCs w:val="22"/>
-          <w:lang w:val="pt-BR"/>
-        </w:rPr>
-        <w:lastRenderedPageBreak/>
-        <w:t>movimentos do mês nesta carteira, não no mercado em geral. Terceiro, a tradução do resultado em texto, gráfico e tabela.</w:t>
-      </w:r>
-    </w:p>
-    <w:p>
-      <w:pPr>
-        <w:jc w:val="both"/>
-        <w:rPr>
-          <w:rFonts w:ascii="Calibri Light" w:hAnsi="Calibri Light" w:cs="Calibri Light"/>
-          <w:sz w:val="22"/>
-          <w:szCs w:val="22"/>
-          <w:lang w:val="pt-BR"/>
-        </w:rPr>
-      </w:pPr>
-      <w:r>
-        <w:rPr>
-          <w:rFonts w:ascii="Calibri Light" w:hAnsi="Calibri Light" w:cs="Calibri Light"/>
-          <w:sz w:val="22"/>
-          <w:szCs w:val="22"/>
-          <w:lang w:val="pt-BR"/>
-        </w:rPr>
-        <w:t>O que foi construído é o encontro dos dois: um portal onde o assessor vê o que aconteceu no dia e, com um botão, produz a carta do mês de um cliente — ou do seu book inteiro.</w:t>
-      </w:r>
-      <w:r>
-        <w:rPr>
-          <w:rFonts w:ascii="Calibri Light" w:hAnsi="Calibri Light" w:cs="Calibri Light"/>
-          <w:sz w:val="22"/>
-          <w:szCs w:val="22"/>
-          <w:lang w:val="pt-BR"/>
-        </w:rPr>
-        <w:t xml:space="preserve"> </w:t>
+        <w:t xml:space="preserve">, e o </w:t>
       </w:r>
       <w:proofErr w:type="spellStart"/>
       <w:r>
@@ -617,7 +1132,7 @@
           <w:szCs w:val="22"/>
           <w:lang w:val="pt-BR"/>
         </w:rPr>
-        <w:t>Cloudflare</w:t>
+        <w:t>Rivet</w:t>
       </w:r>
       <w:proofErr w:type="spellEnd"/>
       <w:r>
@@ -627,67 +1142,7 @@
           <w:szCs w:val="22"/>
           <w:lang w:val="pt-BR"/>
         </w:rPr>
-        <w:t xml:space="preserve"> é onde tudo roda e fica guardado: o </w:t>
-      </w:r>
-      <w:proofErr w:type="spellStart"/>
-      <w:r>
-        <w:rPr>
-          <w:rFonts w:ascii="Calibri Light" w:hAnsi="Calibri Light" w:cs="Calibri Light"/>
-          <w:sz w:val="22"/>
-          <w:szCs w:val="22"/>
-          <w:lang w:val="pt-BR"/>
-        </w:rPr>
-        <w:t>Worker</w:t>
-      </w:r>
-      <w:proofErr w:type="spellEnd"/>
-      <w:r>
-        <w:rPr>
-          <w:rFonts w:ascii="Calibri Light" w:hAnsi="Calibri Light" w:cs="Calibri Light"/>
-          <w:sz w:val="22"/>
-          <w:szCs w:val="22"/>
-          <w:lang w:val="pt-BR"/>
-        </w:rPr>
-        <w:t xml:space="preserve"> serve os portais e a API, os Workflows executam os trabalhos longos (os três agentes do dia, a carta mensal, o lote), o </w:t>
-      </w:r>
-      <w:proofErr w:type="spellStart"/>
-      <w:r>
-        <w:rPr>
-          <w:rFonts w:ascii="Calibri Light" w:hAnsi="Calibri Light" w:cs="Calibri Light"/>
-          <w:sz w:val="22"/>
-          <w:szCs w:val="22"/>
-          <w:lang w:val="pt-BR"/>
-        </w:rPr>
-        <w:t>cron</w:t>
-      </w:r>
-      <w:proofErr w:type="spellEnd"/>
-      <w:r>
-        <w:rPr>
-          <w:rFonts w:ascii="Calibri Light" w:hAnsi="Calibri Light" w:cs="Calibri Light"/>
-          <w:sz w:val="22"/>
-          <w:szCs w:val="22"/>
-          <w:lang w:val="pt-BR"/>
-        </w:rPr>
-        <w:t xml:space="preserve"> os dispara às 07:00, o D1 guarda o registro (clientes, política, aprovações), o R2 os arquivos (</w:t>
-      </w:r>
-      <w:proofErr w:type="spellStart"/>
-      <w:r>
-        <w:rPr>
-          <w:rFonts w:ascii="Calibri Light" w:hAnsi="Calibri Light" w:cs="Calibri Light"/>
-          <w:sz w:val="22"/>
-          <w:szCs w:val="22"/>
-          <w:lang w:val="pt-BR"/>
-        </w:rPr>
-        <w:t>PDFs</w:t>
-      </w:r>
-      <w:proofErr w:type="spellEnd"/>
-      <w:r>
-        <w:rPr>
-          <w:rFonts w:ascii="Calibri Light" w:hAnsi="Calibri Light" w:cs="Calibri Light"/>
-          <w:sz w:val="22"/>
-          <w:szCs w:val="22"/>
-          <w:lang w:val="pt-BR"/>
-        </w:rPr>
-        <w:t>, séries de preços, políticas assinadas) e o KV o cache dos provedores.</w:t>
+        <w:t xml:space="preserve"> existe para que a sequência e os prompts fiquem legíveis e editáveis facilmente.</w:t>
       </w:r>
     </w:p>
     <w:p>
@@ -713,43 +1168,28 @@
           <w:lang w:val="pt-BR"/>
         </w:rPr>
       </w:pPr>
-      <w:proofErr w:type="spellStart"/>
-      <w:r>
-        <w:rPr>
-          <w:rFonts w:ascii="Calibri Light" w:hAnsi="Calibri Light" w:cs="Calibri Light"/>
-          <w:b/>
-          <w:bCs/>
-          <w:sz w:val="22"/>
-          <w:szCs w:val="22"/>
-          <w:lang w:val="pt-BR"/>
-        </w:rPr>
-        <w:t>How</w:t>
-      </w:r>
-      <w:proofErr w:type="spellEnd"/>
-      <w:r>
-        <w:rPr>
-          <w:rFonts w:ascii="Calibri Light" w:hAnsi="Calibri Light" w:cs="Calibri Light"/>
-          <w:b/>
-          <w:bCs/>
-          <w:sz w:val="22"/>
-          <w:szCs w:val="22"/>
-          <w:lang w:val="pt-BR"/>
-        </w:rPr>
-        <w:t xml:space="preserve"> it </w:t>
-      </w:r>
-      <w:proofErr w:type="spellStart"/>
-      <w:r>
-        <w:rPr>
-          <w:rFonts w:ascii="Calibri Light" w:hAnsi="Calibri Light" w:cs="Calibri Light"/>
-          <w:b/>
-          <w:bCs/>
-          <w:sz w:val="22"/>
-          <w:szCs w:val="22"/>
-          <w:lang w:val="pt-BR"/>
-        </w:rPr>
-        <w:t>works</w:t>
-      </w:r>
-      <w:proofErr w:type="spellEnd"/>
+      <w:r>
+        <w:rPr>
+          <w:rFonts w:ascii="Calibri Light" w:hAnsi="Calibri Light" w:cs="Calibri Light"/>
+          <w:b/>
+          <w:bCs/>
+          <w:sz w:val="22"/>
+          <w:szCs w:val="22"/>
+          <w:lang w:val="pt-BR"/>
+        </w:rPr>
+        <w:t>Next</w:t>
+      </w:r>
+      <w:r>
+        <w:rPr>
+          <w:rFonts w:ascii="Calibri Light" w:hAnsi="Calibri Light" w:cs="Calibri Light"/>
+          <w:b/>
+          <w:bCs/>
+          <w:sz w:val="22"/>
+          <w:szCs w:val="22"/>
+          <w:lang w:val="pt-BR"/>
+        </w:rPr>
+        <w:t xml:space="preserve"> steps</w:t>
+      </w:r>
     </w:p>
     <w:p>
       <w:pPr>
@@ -768,47 +1208,189 @@
           <w:szCs w:val="22"/>
           <w:lang w:val="pt-BR"/>
         </w:rPr>
-        <w:t xml:space="preserve">Foram construídos quatro agentes. Três montam o panorama do dia e rodam sozinhos na nuvem, todo dia às sete da manhã — e de novo sempre que o assessor solicitar. O </w:t>
-      </w:r>
-      <w:proofErr w:type="gramStart"/>
-      <w:r>
-        <w:rPr>
-          <w:rFonts w:ascii="Calibri Light" w:hAnsi="Calibri Light" w:cs="Calibri Light"/>
-          <w:sz w:val="22"/>
-          <w:szCs w:val="22"/>
-          <w:lang w:val="pt-BR"/>
-        </w:rPr>
-        <w:t>primeiro busca</w:t>
-      </w:r>
-      <w:proofErr w:type="gramEnd"/>
-      <w:r>
-        <w:rPr>
-          <w:rFonts w:ascii="Calibri Light" w:hAnsi="Calibri Light" w:cs="Calibri Light"/>
-          <w:sz w:val="22"/>
-          <w:szCs w:val="22"/>
-          <w:lang w:val="pt-BR"/>
-        </w:rPr>
-        <w:t xml:space="preserve"> cotações, séries diárias, sinais técnicos e as manchetes das últimas 48 horas, e anota a fonte de cada número que traz. O segundo faz inferência: lê o que o primeiro reuniu junto da exposição de cada cliente por classe de ativo e decide o que, de tudo aquilo, importa para estas carteiras hoje; é ele que escreve o resumo do dia. O terceiro aciona gatilhos e compara cada indicador com os limiares configurados de cada carteira com a política que a governa, e diz quando uma ação é devida. Finalmente, o quarto consolida a carta mensal, comandado pelo assessor a partir da página do cliente, e trabalha em quatro etapas: reúne os dados do mês, calcula rentabilidade, atribuição e propostas, escreve a carta e a diagrama em PDF e e-mail e atualiza portal — e é esse mesmo agente que percorre o book inteiro quando o assessor pede todas as cartas de uma vez.</w:t>
-      </w:r>
-    </w:p>
-    <w:p>
-      <w:pPr>
-        <w:jc w:val="both"/>
-        <w:rPr>
-          <w:rFonts w:ascii="Calibri Light" w:hAnsi="Calibri Light" w:cs="Calibri Light"/>
-          <w:sz w:val="22"/>
-          <w:szCs w:val="22"/>
-          <w:lang w:val="pt-BR"/>
-        </w:rPr>
-      </w:pPr>
-      <w:r>
-        <w:rPr>
-          <w:rFonts w:ascii="Calibri Light" w:hAnsi="Calibri Light" w:cs="Calibri Light"/>
-          <w:sz w:val="22"/>
-          <w:szCs w:val="22"/>
-          <w:lang w:val="pt-BR"/>
-        </w:rPr>
-        <w:t xml:space="preserve">A base da construção foi em Claude </w:t>
+        <w:t>Tudo o que foi construído roda sobre dado</w:t>
+      </w:r>
+      <w:r>
+        <w:rPr>
+          <w:rFonts w:ascii="Calibri Light" w:hAnsi="Calibri Light" w:cs="Calibri Light"/>
+          <w:sz w:val="22"/>
+          <w:szCs w:val="22"/>
+          <w:lang w:val="pt-BR"/>
+        </w:rPr>
+        <w:t>s</w:t>
+      </w:r>
+      <w:r>
+        <w:rPr>
+          <w:rFonts w:ascii="Calibri Light" w:hAnsi="Calibri Light" w:cs="Calibri Light"/>
+          <w:sz w:val="22"/>
+          <w:szCs w:val="22"/>
+          <w:lang w:val="pt-BR"/>
+        </w:rPr>
+        <w:t xml:space="preserve"> </w:t>
+      </w:r>
+      <w:r>
+        <w:rPr>
+          <w:rFonts w:ascii="Calibri Light" w:hAnsi="Calibri Light" w:cs="Calibri Light"/>
+          <w:sz w:val="22"/>
+          <w:szCs w:val="22"/>
+          <w:lang w:val="pt-BR"/>
+        </w:rPr>
+        <w:t>reais</w:t>
+      </w:r>
+      <w:r>
+        <w:rPr>
+          <w:rFonts w:ascii="Calibri Light" w:hAnsi="Calibri Light" w:cs="Calibri Light"/>
+          <w:sz w:val="22"/>
+          <w:szCs w:val="22"/>
+          <w:lang w:val="pt-BR"/>
+        </w:rPr>
+        <w:t xml:space="preserve"> de mercado e dado</w:t>
+      </w:r>
+      <w:r>
+        <w:rPr>
+          <w:rFonts w:ascii="Calibri Light" w:hAnsi="Calibri Light" w:cs="Calibri Light"/>
+          <w:sz w:val="22"/>
+          <w:szCs w:val="22"/>
+          <w:lang w:val="pt-BR"/>
+        </w:rPr>
+        <w:t>s</w:t>
+      </w:r>
+      <w:r>
+        <w:rPr>
+          <w:rFonts w:ascii="Calibri Light" w:hAnsi="Calibri Light" w:cs="Calibri Light"/>
+          <w:sz w:val="22"/>
+          <w:szCs w:val="22"/>
+          <w:lang w:val="pt-BR"/>
+        </w:rPr>
+        <w:t xml:space="preserve"> simulado</w:t>
+      </w:r>
+      <w:r>
+        <w:rPr>
+          <w:rFonts w:ascii="Calibri Light" w:hAnsi="Calibri Light" w:cs="Calibri Light"/>
+          <w:sz w:val="22"/>
+          <w:szCs w:val="22"/>
+          <w:lang w:val="pt-BR"/>
+        </w:rPr>
+        <w:t>s</w:t>
+      </w:r>
+      <w:r>
+        <w:rPr>
+          <w:rFonts w:ascii="Calibri Light" w:hAnsi="Calibri Light" w:cs="Calibri Light"/>
+          <w:sz w:val="22"/>
+          <w:szCs w:val="22"/>
+          <w:lang w:val="pt-BR"/>
+        </w:rPr>
+        <w:t xml:space="preserve"> de cliente</w:t>
+      </w:r>
+      <w:r>
+        <w:rPr>
+          <w:rFonts w:ascii="Calibri Light" w:hAnsi="Calibri Light" w:cs="Calibri Light"/>
+          <w:sz w:val="22"/>
+          <w:szCs w:val="22"/>
+          <w:lang w:val="pt-BR"/>
+        </w:rPr>
+        <w:t>s.</w:t>
+      </w:r>
+      <w:r>
+        <w:rPr>
+          <w:rFonts w:ascii="Calibri Light" w:hAnsi="Calibri Light" w:cs="Calibri Light"/>
+          <w:sz w:val="22"/>
+          <w:szCs w:val="22"/>
+          <w:lang w:val="pt-BR"/>
+        </w:rPr>
+        <w:t xml:space="preserve"> </w:t>
+      </w:r>
+      <w:r>
+        <w:rPr>
+          <w:rFonts w:ascii="Calibri Light" w:hAnsi="Calibri Light" w:cs="Calibri Light"/>
+          <w:sz w:val="22"/>
+          <w:szCs w:val="22"/>
+          <w:lang w:val="pt-BR"/>
+        </w:rPr>
+        <w:t>O</w:t>
+      </w:r>
+      <w:r>
+        <w:rPr>
+          <w:rFonts w:ascii="Calibri Light" w:hAnsi="Calibri Light" w:cs="Calibri Light"/>
+          <w:sz w:val="22"/>
+          <w:szCs w:val="22"/>
+          <w:lang w:val="pt-BR"/>
+        </w:rPr>
+        <w:t xml:space="preserve"> caminho até dado</w:t>
+      </w:r>
+      <w:r>
+        <w:rPr>
+          <w:rFonts w:ascii="Calibri Light" w:hAnsi="Calibri Light" w:cs="Calibri Light"/>
+          <w:sz w:val="22"/>
+          <w:szCs w:val="22"/>
+          <w:lang w:val="pt-BR"/>
+        </w:rPr>
+        <w:t>s</w:t>
+      </w:r>
+      <w:r>
+        <w:rPr>
+          <w:rFonts w:ascii="Calibri Light" w:hAnsi="Calibri Light" w:cs="Calibri Light"/>
+          <w:sz w:val="22"/>
+          <w:szCs w:val="22"/>
+          <w:lang w:val="pt-BR"/>
+        </w:rPr>
+        <w:t xml:space="preserve"> re</w:t>
+      </w:r>
+      <w:r>
+        <w:rPr>
+          <w:rFonts w:ascii="Calibri Light" w:hAnsi="Calibri Light" w:cs="Calibri Light"/>
+          <w:sz w:val="22"/>
+          <w:szCs w:val="22"/>
+          <w:lang w:val="pt-BR"/>
+        </w:rPr>
+        <w:t>ais</w:t>
+      </w:r>
+      <w:r>
+        <w:rPr>
+          <w:rFonts w:ascii="Calibri Light" w:hAnsi="Calibri Light" w:cs="Calibri Light"/>
+          <w:sz w:val="22"/>
+          <w:szCs w:val="22"/>
+          <w:lang w:val="pt-BR"/>
+        </w:rPr>
+        <w:t xml:space="preserve"> passa por </w:t>
+      </w:r>
+      <w:r>
+        <w:rPr>
+          <w:rFonts w:ascii="Calibri Light" w:hAnsi="Calibri Light" w:cs="Calibri Light"/>
+          <w:sz w:val="22"/>
+          <w:szCs w:val="22"/>
+          <w:lang w:val="pt-BR"/>
+        </w:rPr>
+        <w:t>algumas</w:t>
+      </w:r>
+      <w:r>
+        <w:rPr>
+          <w:rFonts w:ascii="Calibri Light" w:hAnsi="Calibri Light" w:cs="Calibri Light"/>
+          <w:sz w:val="22"/>
+          <w:szCs w:val="22"/>
+          <w:lang w:val="pt-BR"/>
+        </w:rPr>
+        <w:t xml:space="preserve"> frentes. Primeiro, </w:t>
+      </w:r>
+      <w:r>
+        <w:rPr>
+          <w:rFonts w:ascii="Calibri Light" w:hAnsi="Calibri Light" w:cs="Calibri Light"/>
+          <w:b/>
+          <w:bCs/>
+          <w:sz w:val="22"/>
+          <w:szCs w:val="22"/>
+          <w:lang w:val="pt-BR"/>
+        </w:rPr>
+        <w:t>acesso</w:t>
+      </w:r>
+      <w:r>
+        <w:rPr>
+          <w:rFonts w:ascii="Calibri Light" w:hAnsi="Calibri Light" w:cs="Calibri Light"/>
+          <w:sz w:val="22"/>
+          <w:szCs w:val="22"/>
+          <w:lang w:val="pt-BR"/>
+        </w:rPr>
+        <w:t xml:space="preserve">: a senha compartilhada do portal sai e entra o SSO corporativo da XP com MFA pelo </w:t>
       </w:r>
       <w:proofErr w:type="spellStart"/>
       <w:r>
@@ -818,7 +1400,7 @@
           <w:szCs w:val="22"/>
           <w:lang w:val="pt-BR"/>
         </w:rPr>
-        <w:t>Code</w:t>
+        <w:t>Cloudflare</w:t>
       </w:r>
       <w:proofErr w:type="spellEnd"/>
       <w:r>
@@ -828,7 +1410,27 @@
           <w:szCs w:val="22"/>
           <w:lang w:val="pt-BR"/>
         </w:rPr>
-        <w:t xml:space="preserve">, usando API da </w:t>
+        <w:t xml:space="preserve"> Access, que o código já prevê, mantendo a regra de que cada assessor enxerga apenas o próprio livro — hoje verificada num único ponto do sistema, e que deve continuar assim. Segundo, </w:t>
+      </w:r>
+      <w:r>
+        <w:rPr>
+          <w:rFonts w:ascii="Calibri Light" w:hAnsi="Calibri Light" w:cs="Calibri Light"/>
+          <w:b/>
+          <w:bCs/>
+          <w:sz w:val="22"/>
+          <w:szCs w:val="22"/>
+          <w:lang w:val="pt-BR"/>
+        </w:rPr>
+        <w:t>compliance</w:t>
+      </w:r>
+      <w:r>
+        <w:rPr>
+          <w:rFonts w:ascii="Calibri Light" w:hAnsi="Calibri Light" w:cs="Calibri Light"/>
+          <w:sz w:val="22"/>
+          <w:szCs w:val="22"/>
+          <w:lang w:val="pt-BR"/>
+        </w:rPr>
+        <w:t xml:space="preserve"> com a nuvem: a </w:t>
       </w:r>
       <w:proofErr w:type="spellStart"/>
       <w:r>
@@ -838,6 +1440,26 @@
           <w:szCs w:val="22"/>
           <w:lang w:val="pt-BR"/>
         </w:rPr>
+        <w:t>Cloudflare</w:t>
+      </w:r>
+      <w:proofErr w:type="spellEnd"/>
+      <w:r>
+        <w:rPr>
+          <w:rFonts w:ascii="Calibri Light" w:hAnsi="Calibri Light" w:cs="Calibri Light"/>
+          <w:sz w:val="22"/>
+          <w:szCs w:val="22"/>
+          <w:lang w:val="pt-BR"/>
+        </w:rPr>
+        <w:t xml:space="preserve"> precisa ser contratada como a CMN 4.893 exige — comunicação ao Banco Central, os requisitos adicionais para processamento no exterior, localização dos dados, direito de auditoria e plano de saída em contrato — e o mesmo vale para a </w:t>
+      </w:r>
+      <w:proofErr w:type="spellStart"/>
+      <w:r>
+        <w:rPr>
+          <w:rFonts w:ascii="Calibri Light" w:hAnsi="Calibri Light" w:cs="Calibri Light"/>
+          <w:sz w:val="22"/>
+          <w:szCs w:val="22"/>
+          <w:lang w:val="pt-BR"/>
+        </w:rPr>
         <w:t>Anthropic</w:t>
       </w:r>
       <w:proofErr w:type="spellEnd"/>
@@ -848,7 +1470,65 @@
           <w:szCs w:val="22"/>
           <w:lang w:val="pt-BR"/>
         </w:rPr>
-        <w:t xml:space="preserve">. Escreve e classifica: a carta, a leitura do dia e o assunto de cada manchete. Recebe os números já calculados; se devolver um que não estava nos fatos, a carta é recusada. Sem chave, um redator determinístico faz o mesmo em português. Cada etapa é um bloco que chama o </w:t>
+        <w:t xml:space="preserve">, com acordo de não-retenção dos prompts. Terceiro, </w:t>
+      </w:r>
+      <w:r>
+        <w:rPr>
+          <w:rFonts w:ascii="Calibri Light" w:hAnsi="Calibri Light" w:cs="Calibri Light"/>
+          <w:b/>
+          <w:bCs/>
+          <w:sz w:val="22"/>
+          <w:szCs w:val="22"/>
+          <w:lang w:val="pt-BR"/>
+        </w:rPr>
+        <w:t>segurança</w:t>
+      </w:r>
+      <w:r>
+        <w:rPr>
+          <w:rFonts w:ascii="Calibri Light" w:hAnsi="Calibri Light" w:cs="Calibri Light"/>
+          <w:sz w:val="22"/>
+          <w:szCs w:val="22"/>
+          <w:lang w:val="pt-BR"/>
+        </w:rPr>
+        <w:t xml:space="preserve"> do dado financeiro: criptografia com chaves geridas pela instituição, segregação por assessor, rotação de segredos, trilha de auditoria export</w:t>
+      </w:r>
+      <w:r>
+        <w:rPr>
+          <w:rFonts w:ascii="Calibri Light" w:hAnsi="Calibri Light" w:cs="Calibri Light"/>
+          <w:sz w:val="22"/>
+          <w:szCs w:val="22"/>
+          <w:lang w:val="pt-BR"/>
+        </w:rPr>
+        <w:t xml:space="preserve">ável </w:t>
+      </w:r>
+      <w:r>
+        <w:rPr>
+          <w:rFonts w:ascii="Calibri Light" w:hAnsi="Calibri Light" w:cs="Calibri Light"/>
+          <w:sz w:val="22"/>
+          <w:szCs w:val="22"/>
+          <w:lang w:val="pt-BR"/>
+        </w:rPr>
+        <w:t xml:space="preserve">e um teste de intrusão independente antes do primeiro cliente. Quarto, </w:t>
+      </w:r>
+      <w:r>
+        <w:rPr>
+          <w:rFonts w:ascii="Calibri Light" w:hAnsi="Calibri Light" w:cs="Calibri Light"/>
+          <w:b/>
+          <w:bCs/>
+          <w:sz w:val="22"/>
+          <w:szCs w:val="22"/>
+          <w:lang w:val="pt-BR"/>
+        </w:rPr>
+        <w:t>sigilo</w:t>
+      </w:r>
+      <w:r>
+        <w:rPr>
+          <w:rFonts w:ascii="Calibri Light" w:hAnsi="Calibri Light" w:cs="Calibri Light"/>
+          <w:sz w:val="22"/>
+          <w:szCs w:val="22"/>
+          <w:lang w:val="pt-BR"/>
+        </w:rPr>
+        <w:t xml:space="preserve">: o sigilo bancário da LC 105 e a LGPD pedem minimização — o modelo já recebe só o objeto de fatos, mas o próximo passo é </w:t>
       </w:r>
       <w:proofErr w:type="spellStart"/>
       <w:r>
@@ -858,7 +1538,7 @@
           <w:szCs w:val="22"/>
           <w:lang w:val="pt-BR"/>
         </w:rPr>
-        <w:t>Worker</w:t>
+        <w:t>pseudonimizar</w:t>
       </w:r>
       <w:proofErr w:type="spellEnd"/>
       <w:r>
@@ -868,389 +1548,7 @@
           <w:szCs w:val="22"/>
           <w:lang w:val="pt-BR"/>
         </w:rPr>
-        <w:t xml:space="preserve">, e o </w:t>
-      </w:r>
-      <w:proofErr w:type="spellStart"/>
-      <w:r>
-        <w:rPr>
-          <w:rFonts w:ascii="Calibri Light" w:hAnsi="Calibri Light" w:cs="Calibri Light"/>
-          <w:sz w:val="22"/>
-          <w:szCs w:val="22"/>
-          <w:lang w:val="pt-BR"/>
-        </w:rPr>
-        <w:t>Rivet</w:t>
-      </w:r>
-      <w:proofErr w:type="spellEnd"/>
-      <w:r>
-        <w:rPr>
-          <w:rFonts w:ascii="Calibri Light" w:hAnsi="Calibri Light" w:cs="Calibri Light"/>
-          <w:sz w:val="22"/>
-          <w:szCs w:val="22"/>
-          <w:lang w:val="pt-BR"/>
-        </w:rPr>
-        <w:t xml:space="preserve"> existe para que a sequência e os prompts fiquem legíveis e editáveis facilmente.</w:t>
-      </w:r>
-    </w:p>
-    <w:p>
-      <w:pPr>
-        <w:jc w:val="both"/>
-        <w:rPr>
-          <w:rFonts w:ascii="Calibri Light" w:hAnsi="Calibri Light" w:cs="Calibri Light"/>
-          <w:sz w:val="22"/>
-          <w:szCs w:val="22"/>
-          <w:lang w:val="pt-BR"/>
-        </w:rPr>
-      </w:pPr>
-    </w:p>
-    <w:p>
-      <w:pPr>
-        <w:jc w:val="both"/>
-        <w:rPr>
-          <w:rFonts w:ascii="Calibri Light" w:hAnsi="Calibri Light" w:cs="Calibri Light"/>
-          <w:b/>
-          <w:bCs/>
-          <w:sz w:val="22"/>
-          <w:szCs w:val="22"/>
-          <w:lang w:val="pt-BR"/>
-        </w:rPr>
-      </w:pPr>
-      <w:r>
-        <w:rPr>
-          <w:rFonts w:ascii="Calibri Light" w:hAnsi="Calibri Light" w:cs="Calibri Light"/>
-          <w:b/>
-          <w:bCs/>
-          <w:sz w:val="22"/>
-          <w:szCs w:val="22"/>
-          <w:lang w:val="pt-BR"/>
-        </w:rPr>
-        <w:t>Next</w:t>
-      </w:r>
-      <w:r>
-        <w:rPr>
-          <w:rFonts w:ascii="Calibri Light" w:hAnsi="Calibri Light" w:cs="Calibri Light"/>
-          <w:b/>
-          <w:bCs/>
-          <w:sz w:val="22"/>
-          <w:szCs w:val="22"/>
-          <w:lang w:val="pt-BR"/>
-        </w:rPr>
-        <w:t xml:space="preserve"> steps</w:t>
-      </w:r>
-    </w:p>
-    <w:p>
-      <w:pPr>
-        <w:jc w:val="both"/>
-        <w:rPr>
-          <w:rFonts w:ascii="Calibri Light" w:hAnsi="Calibri Light" w:cs="Calibri Light"/>
-          <w:sz w:val="22"/>
-          <w:szCs w:val="22"/>
-          <w:lang w:val="pt-BR"/>
-        </w:rPr>
-      </w:pPr>
-      <w:r>
-        <w:rPr>
-          <w:rFonts w:ascii="Calibri Light" w:hAnsi="Calibri Light" w:cs="Calibri Light"/>
-          <w:sz w:val="22"/>
-          <w:szCs w:val="22"/>
-          <w:lang w:val="pt-BR"/>
-        </w:rPr>
-        <w:t>Tudo o que foi construído roda sobre dado</w:t>
-      </w:r>
-      <w:r>
-        <w:rPr>
-          <w:rFonts w:ascii="Calibri Light" w:hAnsi="Calibri Light" w:cs="Calibri Light"/>
-          <w:sz w:val="22"/>
-          <w:szCs w:val="22"/>
-          <w:lang w:val="pt-BR"/>
-        </w:rPr>
-        <w:t>s</w:t>
-      </w:r>
-      <w:r>
-        <w:rPr>
-          <w:rFonts w:ascii="Calibri Light" w:hAnsi="Calibri Light" w:cs="Calibri Light"/>
-          <w:sz w:val="22"/>
-          <w:szCs w:val="22"/>
-          <w:lang w:val="pt-BR"/>
-        </w:rPr>
-        <w:t xml:space="preserve"> </w:t>
-      </w:r>
-      <w:r>
-        <w:rPr>
-          <w:rFonts w:ascii="Calibri Light" w:hAnsi="Calibri Light" w:cs="Calibri Light"/>
-          <w:sz w:val="22"/>
-          <w:szCs w:val="22"/>
-          <w:lang w:val="pt-BR"/>
-        </w:rPr>
-        <w:t>reais</w:t>
-      </w:r>
-      <w:r>
-        <w:rPr>
-          <w:rFonts w:ascii="Calibri Light" w:hAnsi="Calibri Light" w:cs="Calibri Light"/>
-          <w:sz w:val="22"/>
-          <w:szCs w:val="22"/>
-          <w:lang w:val="pt-BR"/>
-        </w:rPr>
-        <w:t xml:space="preserve"> de mercado e dado</w:t>
-      </w:r>
-      <w:r>
-        <w:rPr>
-          <w:rFonts w:ascii="Calibri Light" w:hAnsi="Calibri Light" w:cs="Calibri Light"/>
-          <w:sz w:val="22"/>
-          <w:szCs w:val="22"/>
-          <w:lang w:val="pt-BR"/>
-        </w:rPr>
-        <w:t>s</w:t>
-      </w:r>
-      <w:r>
-        <w:rPr>
-          <w:rFonts w:ascii="Calibri Light" w:hAnsi="Calibri Light" w:cs="Calibri Light"/>
-          <w:sz w:val="22"/>
-          <w:szCs w:val="22"/>
-          <w:lang w:val="pt-BR"/>
-        </w:rPr>
-        <w:t xml:space="preserve"> simulado de cliente</w:t>
-      </w:r>
-      <w:r>
-        <w:rPr>
-          <w:rFonts w:ascii="Calibri Light" w:hAnsi="Calibri Light" w:cs="Calibri Light"/>
-          <w:sz w:val="22"/>
-          <w:szCs w:val="22"/>
-          <w:lang w:val="pt-BR"/>
-        </w:rPr>
-        <w:t>s.</w:t>
-      </w:r>
-      <w:r>
-        <w:rPr>
-          <w:rFonts w:ascii="Calibri Light" w:hAnsi="Calibri Light" w:cs="Calibri Light"/>
-          <w:sz w:val="22"/>
-          <w:szCs w:val="22"/>
-          <w:lang w:val="pt-BR"/>
-        </w:rPr>
-        <w:t xml:space="preserve"> </w:t>
-      </w:r>
-      <w:r>
-        <w:rPr>
-          <w:rFonts w:ascii="Calibri Light" w:hAnsi="Calibri Light" w:cs="Calibri Light"/>
-          <w:sz w:val="22"/>
-          <w:szCs w:val="22"/>
-          <w:lang w:val="pt-BR"/>
-        </w:rPr>
-        <w:t>O</w:t>
-      </w:r>
-      <w:r>
-        <w:rPr>
-          <w:rFonts w:ascii="Calibri Light" w:hAnsi="Calibri Light" w:cs="Calibri Light"/>
-          <w:sz w:val="22"/>
-          <w:szCs w:val="22"/>
-          <w:lang w:val="pt-BR"/>
-        </w:rPr>
-        <w:t xml:space="preserve"> caminho até dado real de cliente passa por </w:t>
-      </w:r>
-      <w:r>
-        <w:rPr>
-          <w:rFonts w:ascii="Calibri Light" w:hAnsi="Calibri Light" w:cs="Calibri Light"/>
-          <w:sz w:val="22"/>
-          <w:szCs w:val="22"/>
-          <w:lang w:val="pt-BR"/>
-        </w:rPr>
-        <w:t>algumas</w:t>
-      </w:r>
-      <w:r>
-        <w:rPr>
-          <w:rFonts w:ascii="Calibri Light" w:hAnsi="Calibri Light" w:cs="Calibri Light"/>
-          <w:sz w:val="22"/>
-          <w:szCs w:val="22"/>
-          <w:lang w:val="pt-BR"/>
-        </w:rPr>
-        <w:t xml:space="preserve"> frentes. Primeiro, </w:t>
-      </w:r>
-      <w:r>
-        <w:rPr>
-          <w:rFonts w:ascii="Calibri Light" w:hAnsi="Calibri Light" w:cs="Calibri Light"/>
-          <w:b/>
-          <w:bCs/>
-          <w:sz w:val="22"/>
-          <w:szCs w:val="22"/>
-          <w:lang w:val="pt-BR"/>
-        </w:rPr>
-        <w:t>acesso</w:t>
-      </w:r>
-      <w:r>
-        <w:rPr>
-          <w:rFonts w:ascii="Calibri Light" w:hAnsi="Calibri Light" w:cs="Calibri Light"/>
-          <w:sz w:val="22"/>
-          <w:szCs w:val="22"/>
-          <w:lang w:val="pt-BR"/>
-        </w:rPr>
-        <w:t xml:space="preserve">: a senha compartilhada do portal sai e entra o SSO corporativo da XP com MFA pelo </w:t>
-      </w:r>
-      <w:proofErr w:type="spellStart"/>
-      <w:r>
-        <w:rPr>
-          <w:rFonts w:ascii="Calibri Light" w:hAnsi="Calibri Light" w:cs="Calibri Light"/>
-          <w:sz w:val="22"/>
-          <w:szCs w:val="22"/>
-          <w:lang w:val="pt-BR"/>
-        </w:rPr>
-        <w:t>Cloudflare</w:t>
-      </w:r>
-      <w:proofErr w:type="spellEnd"/>
-      <w:r>
-        <w:rPr>
-          <w:rFonts w:ascii="Calibri Light" w:hAnsi="Calibri Light" w:cs="Calibri Light"/>
-          <w:sz w:val="22"/>
-          <w:szCs w:val="22"/>
-          <w:lang w:val="pt-BR"/>
-        </w:rPr>
-        <w:t xml:space="preserve"> Access, que o código já prevê, mantendo a regra de que cada assessor enxerga apenas o próprio livro — hoje verificada num único ponto do sistema, e que deve continuar assim. Segundo, </w:t>
-      </w:r>
-      <w:r>
-        <w:rPr>
-          <w:rFonts w:ascii="Calibri Light" w:hAnsi="Calibri Light" w:cs="Calibri Light"/>
-          <w:b/>
-          <w:bCs/>
-          <w:sz w:val="22"/>
-          <w:szCs w:val="22"/>
-          <w:lang w:val="pt-BR"/>
-        </w:rPr>
-        <w:t>compliance</w:t>
-      </w:r>
-      <w:r>
-        <w:rPr>
-          <w:rFonts w:ascii="Calibri Light" w:hAnsi="Calibri Light" w:cs="Calibri Light"/>
-          <w:sz w:val="22"/>
-          <w:szCs w:val="22"/>
-          <w:lang w:val="pt-BR"/>
-        </w:rPr>
-        <w:t xml:space="preserve"> com a nuvem: a </w:t>
-      </w:r>
-      <w:proofErr w:type="spellStart"/>
-      <w:r>
-        <w:rPr>
-          <w:rFonts w:ascii="Calibri Light" w:hAnsi="Calibri Light" w:cs="Calibri Light"/>
-          <w:sz w:val="22"/>
-          <w:szCs w:val="22"/>
-          <w:lang w:val="pt-BR"/>
-        </w:rPr>
-        <w:t>Cloudflare</w:t>
-      </w:r>
-      <w:proofErr w:type="spellEnd"/>
-      <w:r>
-        <w:rPr>
-          <w:rFonts w:ascii="Calibri Light" w:hAnsi="Calibri Light" w:cs="Calibri Light"/>
-          <w:sz w:val="22"/>
-          <w:szCs w:val="22"/>
-          <w:lang w:val="pt-BR"/>
-        </w:rPr>
-        <w:t xml:space="preserve"> precisa ser contratada como a CMN 4.893 exige — comunicação ao Banco Central, os requisitos adicionais para processamento no exterior, localização dos dados, direito de auditoria e plano de saída em contrato — e o mesmo vale para a </w:t>
-      </w:r>
-      <w:proofErr w:type="spellStart"/>
-      <w:r>
-        <w:rPr>
-          <w:rFonts w:ascii="Calibri Light" w:hAnsi="Calibri Light" w:cs="Calibri Light"/>
-          <w:sz w:val="22"/>
-          <w:szCs w:val="22"/>
-          <w:lang w:val="pt-BR"/>
-        </w:rPr>
-        <w:t>Anthropic</w:t>
-      </w:r>
-      <w:proofErr w:type="spellEnd"/>
-      <w:r>
-        <w:rPr>
-          <w:rFonts w:ascii="Calibri Light" w:hAnsi="Calibri Light" w:cs="Calibri Light"/>
-          <w:sz w:val="22"/>
-          <w:szCs w:val="22"/>
-          <w:lang w:val="pt-BR"/>
-        </w:rPr>
-        <w:t xml:space="preserve">, com acordo de não-retenção dos prompts. Terceiro, </w:t>
-      </w:r>
-      <w:r>
-        <w:rPr>
-          <w:rFonts w:ascii="Calibri Light" w:hAnsi="Calibri Light" w:cs="Calibri Light"/>
-          <w:b/>
-          <w:bCs/>
-          <w:sz w:val="22"/>
-          <w:szCs w:val="22"/>
-          <w:lang w:val="pt-BR"/>
-        </w:rPr>
-        <w:t>segurança</w:t>
-      </w:r>
-      <w:r>
-        <w:rPr>
-          <w:rFonts w:ascii="Calibri Light" w:hAnsi="Calibri Light" w:cs="Calibri Light"/>
-          <w:sz w:val="22"/>
-          <w:szCs w:val="22"/>
-          <w:lang w:val="pt-BR"/>
-        </w:rPr>
-        <w:t xml:space="preserve"> do dado financeiro: criptografia com chaves geridas pela instituição, segregação por assessor, rotação de segredos, trilha de auditoria export</w:t>
-      </w:r>
-      <w:r>
-        <w:rPr>
-          <w:rFonts w:ascii="Calibri Light" w:hAnsi="Calibri Light" w:cs="Calibri Light"/>
-          <w:sz w:val="22"/>
-          <w:szCs w:val="22"/>
-          <w:lang w:val="pt-BR"/>
-        </w:rPr>
-        <w:t xml:space="preserve">ável </w:t>
-      </w:r>
-      <w:r>
-        <w:rPr>
-          <w:rFonts w:ascii="Calibri Light" w:hAnsi="Calibri Light" w:cs="Calibri Light"/>
-          <w:sz w:val="22"/>
-          <w:szCs w:val="22"/>
-          <w:lang w:val="pt-BR"/>
-        </w:rPr>
-        <w:t xml:space="preserve">e um teste de intrusão independente antes do primeiro cliente. Quarto, </w:t>
-      </w:r>
-      <w:r>
-        <w:rPr>
-          <w:rFonts w:ascii="Calibri Light" w:hAnsi="Calibri Light" w:cs="Calibri Light"/>
-          <w:b/>
-          <w:bCs/>
-          <w:sz w:val="22"/>
-          <w:szCs w:val="22"/>
-          <w:lang w:val="pt-BR"/>
-        </w:rPr>
-        <w:t>sigilo</w:t>
-      </w:r>
-      <w:r>
-        <w:rPr>
-          <w:rFonts w:ascii="Calibri Light" w:hAnsi="Calibri Light" w:cs="Calibri Light"/>
-          <w:sz w:val="22"/>
-          <w:szCs w:val="22"/>
-          <w:lang w:val="pt-BR"/>
-        </w:rPr>
-        <w:t xml:space="preserve">: o sigilo bancário da LC 105 e a LGPD pedem minimização — o modelo já recebe só o objeto de fatos, mas o próximo passo é </w:t>
-      </w:r>
-      <w:proofErr w:type="spellStart"/>
-      <w:r>
-        <w:rPr>
-          <w:rFonts w:ascii="Calibri Light" w:hAnsi="Calibri Light" w:cs="Calibri Light"/>
-          <w:sz w:val="22"/>
-          <w:szCs w:val="22"/>
-          <w:lang w:val="pt-BR"/>
-        </w:rPr>
-        <w:t>pseudonimizar</w:t>
-      </w:r>
-      <w:proofErr w:type="spellEnd"/>
-      <w:r>
-        <w:rPr>
-          <w:rFonts w:ascii="Calibri Light" w:hAnsi="Calibri Light" w:cs="Calibri Light"/>
-          <w:sz w:val="22"/>
-          <w:szCs w:val="22"/>
-          <w:lang w:val="pt-BR"/>
-        </w:rPr>
-        <w:t xml:space="preserve"> </w:t>
-      </w:r>
-      <w:r>
-        <w:rPr>
-          <w:rFonts w:ascii="Calibri Light" w:hAnsi="Calibri Light" w:cs="Calibri Light"/>
-          <w:sz w:val="22"/>
-          <w:szCs w:val="22"/>
-          <w:lang w:val="pt-BR"/>
-        </w:rPr>
-        <w:lastRenderedPageBreak/>
-        <w:t xml:space="preserve">nome e documento no prompt, definir retenção para cartas e logs e registrar quem viu o quê. Quinto, </w:t>
+        <w:t xml:space="preserve"> nome e documento no prompt, definir retenção para cartas e logs e registrar quem viu o quê. Quinto, </w:t>
       </w:r>
       <w:r>
         <w:rPr>
@@ -1325,7 +1623,7 @@
     <w:sectPr>
       <w:headerReference w:type="default" r:id="rId6"/>
       <w:pgSz w:w="12240" w:h="15840"/>
-      <w:pgMar w:top="1440" w:right="1440" w:bottom="1440" w:left="1440" w:header="720" w:footer="720" w:gutter="0"/>
+      <w:pgMar w:top="1152" w:right="1152" w:bottom="1152" w:left="1152" w:header="720" w:footer="720" w:gutter="0"/>
       <w:cols w:space="720"/>
       <w:docGrid w:linePitch="360"/>
     </w:sectPr>
@@ -1391,23 +1689,11 @@
       <w:jc w:val="right"/>
     </w:pPr>
     <w:r>
-      <w:fldChar w:fldCharType="begin"/>
-    </w:r>
-    <w:r>
-      <w:instrText xml:space="preserve"> INCLUDEPICTURE "/Users/joaocreste/Library/Group Containers/UBF8T346G9.ms/WebArchiveCopyPasteTempFiles/com.microsoft.Word/69f9fba11be2f9d7a3389c24_OpenGraph.png" \* MERGEFORMATINET </w:instrText>
-    </w:r>
-    <w:r>
-      <w:fldChar w:fldCharType="separate"/>
-    </w:r>
-    <w:r>
-      <w:rPr>
-        <w:noProof/>
-      </w:rPr>
       <w:drawing>
-        <wp:inline distT="0" distB="0" distL="0" distR="0" wp14:anchorId="34C28A47" wp14:editId="6BFB6E13">
-          <wp:extent cx="797522" cy="418699"/>
-          <wp:effectExtent l="0" t="0" r="3175" b="635"/>
-          <wp:docPr id="338063115" name="Picture 1" descr="ENTER | Agentes de IA para contencioso de massa"/>
+        <wp:inline distT="0" distB="0" distL="0" distR="0" wp14:anchorId="43DEA3C5" wp14:editId="13C87984">
+          <wp:extent cx="937727" cy="286327"/>
+          <wp:effectExtent l="0" t="0" r="2540" b="6350"/>
+          <wp:docPr id="2019064425" name="Picture 1"/>
           <wp:cNvGraphicFramePr>
             <a:graphicFrameLocks xmlns:a="http://schemas.openxmlformats.org/drawingml/2006/main" noChangeAspect="1"/>
           </wp:cNvGraphicFramePr>
@@ -1415,45 +1701,29 @@
             <a:graphicData uri="http://schemas.openxmlformats.org/drawingml/2006/picture">
               <pic:pic xmlns:pic="http://schemas.openxmlformats.org/drawingml/2006/picture">
                 <pic:nvPicPr>
-                  <pic:cNvPr id="0" name="Picture 1" descr="ENTER | Agentes de IA para contencioso de massa"/>
-                  <pic:cNvPicPr>
-                    <a:picLocks noChangeAspect="1" noChangeArrowheads="1"/>
-                  </pic:cNvPicPr>
+                  <pic:cNvPr id="2019064425" name=""/>
+                  <pic:cNvPicPr/>
                 </pic:nvPicPr>
                 <pic:blipFill>
-                  <a:blip r:embed="rId1">
-                    <a:extLst>
-                      <a:ext uri="{28A0092B-C50C-407E-A947-70E740481C1C}">
-                        <a14:useLocalDpi xmlns:a14="http://schemas.microsoft.com/office/drawing/2010/main" val="0"/>
-                      </a:ext>
-                    </a:extLst>
-                  </a:blip>
-                  <a:srcRect/>
+                  <a:blip r:embed="rId1"/>
                   <a:stretch>
                     <a:fillRect/>
                   </a:stretch>
                 </pic:blipFill>
-                <pic:spPr bwMode="auto">
+                <pic:spPr>
                   <a:xfrm>
                     <a:off x="0" y="0"/>
-                    <a:ext cx="983884" cy="516539"/>
+                    <a:ext cx="1041801" cy="318105"/>
                   </a:xfrm>
                   <a:prstGeom prst="rect">
                     <a:avLst/>
                   </a:prstGeom>
-                  <a:noFill/>
-                  <a:ln>
-                    <a:noFill/>
-                  </a:ln>
                 </pic:spPr>
               </pic:pic>
             </a:graphicData>
           </a:graphic>
         </wp:inline>
       </w:drawing>
-    </w:r>
-    <w:r>
-      <w:fldChar w:fldCharType="end"/>
     </w:r>
   </w:p>
 </w:hdr>

</xml_diff>